<commit_message>
docs: update final capstone Word and PDF reports with INR, latest SonarQube metrics, and Phases 13-15 marks breakdown
</commit_message>
<xml_diff>
--- a/docs/final/Secure_Software_Engineering_Final_Report.docx
+++ b/docs/final/Secure_Software_Engineering_Final_Report.docx
@@ -260,7 +260,7 @@
                 <w:color w:val="166534"/>
                 <w:sz w:val="19"/>
               </w:rPr>
-              <w:t>SonarQube 9.9 LTS PASSED (0 Vulnerabilities, 0 Bugs, 0 Hotspots, 62.6% Coverage)</w:t>
+              <w:t>SonarQube 9.9 LTS PASSED (0 Vulnerabilities, 0 Bugs, 0 Hotspots, 69.8% Coverage, 2.5% Duplications)</w:t>
             </w:r>
           </w:p>
         </w:tc>
@@ -906,7 +906,7 @@
                 <w:b/>
                 <w:sz w:val="17"/>
               </w:rPr>
-              <w:t>Phase 13</w:t>
+              <w:t>Phase 13 [7 Marks]</w:t>
             </w:r>
           </w:p>
         </w:tc>
@@ -935,7 +935,7 @@
               <w:rPr>
                 <w:sz w:val="17"/>
               </w:rPr>
-              <w:t>Multi-stage non-root Dockerfiles (UID 10001 / UID 101), docker-compose, 11 k8s manifests</w:t>
+              <w:t>Multi-stage non-root Dockerfiles (UID 10001 / UID 101), 4 security practices, 11 k8s manifests in dwpg namespace, 2+ security controls</w:t>
             </w:r>
           </w:p>
         </w:tc>
@@ -952,7 +952,7 @@
                 <w:b/>
                 <w:sz w:val="17"/>
               </w:rPr>
-              <w:t>Phase 14</w:t>
+              <w:t>Phase 14 [7 Marks]</w:t>
             </w:r>
           </w:p>
         </w:tc>
@@ -981,7 +981,7 @@
               <w:rPr>
                 <w:sz w:val="17"/>
               </w:rPr>
-              <w:t>GitHub Actions workflow, 6 automated pipeline stages, Trivy scanning, Kubeconform linting</w:t>
+              <w:t>GitHub Actions workflow (5 stages), Unit/Integration/E2E tests, Input boundary fuzzing, DEF-001 defect retest</w:t>
             </w:r>
           </w:p>
         </w:tc>
@@ -998,7 +998,7 @@
                 <w:b/>
                 <w:sz w:val="17"/>
               </w:rPr>
-              <w:t>Phase 15</w:t>
+              <w:t>Phase 15 [5 Marks]</w:t>
             </w:r>
           </w:p>
         </w:tc>
@@ -1027,7 +1027,7 @@
               <w:rPr>
                 <w:sz w:val="17"/>
               </w:rPr>
-              <w:t>AuditService PII scrub, SIEM detection rules, hardening checklists, Prometheus metrics</w:t>
+              <w:t>AuditService 12 security events, 5 SIEM alerts, 6-domain hardening checklist, physical/operational controls</w:t>
             </w:r>
           </w:p>
         </w:tc>
@@ -1301,7 +1301,7 @@
       <w:r>
         <w:t>Section 11.1: SonarQube SAST Analysis:</w:t>
         <w:br/>
-        <w:t>Static code analysis was executed using SonarQube 9.9.8 LTS against 68 indexed source files (2,375 NCLOC). The automated Quality Gate evaluated to PASSED / OK. One initial BLOCKER vulnerability (java:S6437 - hardcoded seed password) was remediated by externalizing admin credentials to environment variable ADMIN_INITIAL_PASSWORD with randomized CSPRNG fallback. Final SAST metrics: 0 Vulnerabilities, 0 Bugs, 0 Security Hotspots, 0.0% Duplications, 4 trivial Code Smells, and 62.6% Coverage.</w:t>
+        <w:t>Static code analysis was executed using SonarQube 9.9.8 LTS against 68 indexed source files (2,375 NCLOC). The automated Quality Gate evaluated to PASSED / OK. One initial BLOCKER vulnerability (java:S6437 - hardcoded seed password) was remediated by externalizing admin credentials to environment variable ADMIN_INITIAL_PASSWORD with randomized CSPRNG fallback. Final SAST metrics: 0 Vulnerabilities, 0 Bugs, 0 Security Hotspots, 2.5% Duplications, Quality Gate: OK, and 69.8% Coverage. SonarQube S6437 (credentials) and S2245 (weak PRNG replaced with SecureRandom) remediated.</w:t>
       </w:r>
     </w:p>
     <w:p>
@@ -1316,7 +1316,7 @@
         <w:br/>
         <w:t>3. MariaDB Pessimistic Locking: WalletRepository applies @Lock(LockModeType.PESSIMISTIC_WRITE) executing 'SELECT ... FOR UPDATE'.</w:t>
         <w:br/>
-        <w:t>Verification: PaymentConcurrencyTest executed 10 simultaneous threads with $50 debit against a $100 balance. Exactly 2 transactions succeeded, exactly 8 failed with InsufficientFundsException, and the final balance was exactly $0.00.</w:t>
+        <w:t>Verification: PaymentConcurrencyTest executed 10 simultaneous threads with ₹50 debit against a ₹100 balance. Exactly 2 transactions succeeded, exactly 8 failed with InsufficientFundsException, and the final balance was exactly ₹0.00 INR.</w:t>
       </w:r>
     </w:p>
     <w:p>
@@ -1324,7 +1324,7 @@
         <w:pStyle w:val="Heading1"/>
       </w:pPr>
       <w:r>
-        <w:t>Phase 13 &amp; 14: Containerization and CI/CD Pipeline</w:t>
+        <w:t>Phase 13 [7 Marks] &amp; Phase 14 [7 Marks]: Containerization and CI/CD Pipeline</w:t>
       </w:r>
     </w:p>
     <w:p>
@@ -1352,7 +1352,7 @@
         <w:pStyle w:val="Heading1"/>
       </w:pPr>
       <w:r>
-        <w:t>Phase 15 &amp; 16: Hardening, SIEM Logging &amp; Final Verification</w:t>
+        <w:t>Phase 15 [5 Marks] &amp; Phase 16: Hardening, SIEM Logging &amp; Final Verification</w:t>
       </w:r>
     </w:p>
     <w:p>

</xml_diff>